<commit_message>
On the scanner in Spanish, tighter trainee sheets, supervisors' guide PDF
- 23 Spanish On the scanner pages, with their booklet as PDF and Word
- Check-off, quiz and word list each fit their pages
- Guide PDFs rebuilt for the second-count and training-day changes

Co-Authored-By: Claude Opus 5.5 <noreply@anthropic.com>
Claude-Session: https://claude.ai/code/session_01LaCZ626Y2oWoWchJeisbmg
</commit_message>
<xml_diff>
--- a/docs/training/print/on-the-scanner.docx
+++ b/docs/training/print/on-the-scanner.docx
@@ -7901,7 +7901,7 @@
                 <w:sz w:val="16"/>
                 <w:szCs w:val="16"/>
               </w:rPr>
-              <w:t xml:space="preserve">A second count: go to the bin, count everything in it, then Bin done.</w:t>
+              <w:t xml:space="preserve">A second count: go to the bin and count everything in it. It moves on once every pallet expected there is counted.</w:t>
             </w:r>
           </w:p>
         </w:tc>
@@ -7986,7 +7986,51 @@
         <w:jc w:val="left"/>
       </w:pPr>
       <w:r>
-        <w:t xml:space="preserve">Count everything in that spot: rack label, pallet label, quantity, for every pallet. An empty spot: </w:t>
+        <w:t xml:space="preserve">Count everything in that spot: rack label, pallet label, quantity, for every pallet.</w:t>
+      </w:r>
+    </w:p>
+    <w:p>
+      <w:pPr>
+        <w:numPr>
+          <w:ilvl w:val="0"/>
+          <w:numId w:val="124"/>
+        </w:numPr>
+        <w:spacing w:before="0" w:after="60" w:line="252" w:lineRule="auto"/>
+        <w:jc w:val="left"/>
+      </w:pPr>
+      <w:r>
+        <w:t xml:space="preserve">Once every pallet the report expects in that spot is counted, the scanner finishes the second count by itself: </w:t>
+      </w:r>
+      <w:r>
+        <w:rPr>
+          <w:i/>
+        </w:rPr>
+        <w:t xml:space="preserve">Bin … done — every pallet expected there is counted</w:t>
+      </w:r>
+      <w:r>
+        <w:t xml:space="preserve">, and the next one comes up.</w:t>
+      </w:r>
+    </w:p>
+    <w:p>
+      <w:pPr>
+        <w:numPr>
+          <w:ilvl w:val="0"/>
+          <w:numId w:val="124"/>
+        </w:numPr>
+        <w:spacing w:before="0" w:after="60" w:line="252" w:lineRule="auto"/>
+        <w:jc w:val="left"/>
+      </w:pPr>
+      <w:r>
+        <w:t xml:space="preserve">Fewer pallets there than that, or none at all: tap </w:t>
+      </w:r>
+      <w:r>
+        <w:rPr>
+          <w:b/>
+        </w:rPr>
+        <w:t xml:space="preserve">Bin done — nothing more here</w:t>
+      </w:r>
+      <w:r>
+        <w:t xml:space="preserve"> when you have counted what is there. An empty spot: </w:t>
       </w:r>
       <w:r>
         <w:rPr>
@@ -7996,28 +8040,6 @@
       </w:r>
       <w:r>
         <w:t xml:space="preserve">.</w:t>
-      </w:r>
-    </w:p>
-    <w:p>
-      <w:pPr>
-        <w:numPr>
-          <w:ilvl w:val="0"/>
-          <w:numId w:val="124"/>
-        </w:numPr>
-        <w:spacing w:before="0" w:after="60" w:line="252" w:lineRule="auto"/>
-        <w:jc w:val="left"/>
-      </w:pPr>
-      <w:r>
-        <w:t xml:space="preserve">Tap </w:t>
-      </w:r>
-      <w:r>
-        <w:rPr>
-          <w:b/>
-        </w:rPr>
-        <w:t xml:space="preserve">Bin done — nothing more here</w:t>
-      </w:r>
-      <w:r>
-        <w:t xml:space="preserve">. The next one comes up.</w:t>
       </w:r>
     </w:p>
     <w:p>

</xml_diff>